<commit_message>
Regenerate the Tupelo packet against the trimmed capture sheet
Same 33 screens, 27 venues, 27 stops, 27 labels and 22 over-target readings
as the 2026-08-04 build. The brief now runs five steps instead of six and
leads with the introduction, the field sheet carries 16 columns instead of
18, and the labels say PROPERTY OF MCTV DIGITAL with a phone number.
</commit_message>
<xml_diff>
--- a/docs/audits/tupelo-2026-08/MCTV_FieldAuditLabels_Tupelo.docx
+++ b/docs/audits/tupelo-2026-08/MCTV_FieldAuditLabels_Tupelo.docx
@@ -77,7 +77,7 @@
                       <w:color w:val="C5A55A"/>
                       <w:sz w:val="13"/>
                     </w:rPr>
-                    <w:t>MCTV DIGITAL  ·  DO NOT REMOVE</w:t>
+                    <w:t>PROPERTY OF MCTV DIGITAL  ·  DO NOT REMOVE</w:t>
                   </w:r>
                 </w:p>
                 <w:p>
@@ -133,7 +133,7 @@
                       <w:color w:val="555555"/>
                       <w:sz w:val="13"/>
                     </w:rPr>
-                    <w:t>Property of MCTV Digital  |  portal@mctvofms.com</w:t>
+                    <w:t>Questions? 601-201-8202  |  portal@mctvofms.com</w:t>
                   </w:r>
                 </w:p>
               </w:tc>
@@ -249,7 +249,7 @@
                       <w:color w:val="C5A55A"/>
                       <w:sz w:val="13"/>
                     </w:rPr>
-                    <w:t>MCTV DIGITAL  ·  DO NOT REMOVE</w:t>
+                    <w:t>PROPERTY OF MCTV DIGITAL  ·  DO NOT REMOVE</w:t>
                   </w:r>
                 </w:p>
                 <w:p>
@@ -305,7 +305,7 @@
                       <w:color w:val="555555"/>
                       <w:sz w:val="13"/>
                     </w:rPr>
-                    <w:t>Property of MCTV Digital  |  portal@mctvofms.com</w:t>
+                    <w:t>Questions? 601-201-8202  |  portal@mctvofms.com</w:t>
                   </w:r>
                 </w:p>
               </w:tc>
@@ -420,7 +420,7 @@
                       <w:color w:val="C5A55A"/>
                       <w:sz w:val="13"/>
                     </w:rPr>
-                    <w:t>MCTV DIGITAL  ·  DO NOT REMOVE</w:t>
+                    <w:t>PROPERTY OF MCTV DIGITAL  ·  DO NOT REMOVE</w:t>
                   </w:r>
                 </w:p>
                 <w:p>
@@ -476,7 +476,7 @@
                       <w:color w:val="555555"/>
                       <w:sz w:val="13"/>
                     </w:rPr>
-                    <w:t>Property of MCTV Digital  |  portal@mctvofms.com</w:t>
+                    <w:t>Questions? 601-201-8202  |  portal@mctvofms.com</w:t>
                   </w:r>
                 </w:p>
               </w:tc>
@@ -592,7 +592,7 @@
                       <w:color w:val="C5A55A"/>
                       <w:sz w:val="13"/>
                     </w:rPr>
-                    <w:t>MCTV DIGITAL  ·  DO NOT REMOVE</w:t>
+                    <w:t>PROPERTY OF MCTV DIGITAL  ·  DO NOT REMOVE</w:t>
                   </w:r>
                 </w:p>
                 <w:p>
@@ -648,7 +648,7 @@
                       <w:color w:val="555555"/>
                       <w:sz w:val="13"/>
                     </w:rPr>
-                    <w:t>Property of MCTV Digital  |  portal@mctvofms.com</w:t>
+                    <w:t>Questions? 601-201-8202  |  portal@mctvofms.com</w:t>
                   </w:r>
                 </w:p>
               </w:tc>
@@ -763,7 +763,7 @@
                       <w:color w:val="C5A55A"/>
                       <w:sz w:val="13"/>
                     </w:rPr>
-                    <w:t>MCTV DIGITAL  ·  DO NOT REMOVE</w:t>
+                    <w:t>PROPERTY OF MCTV DIGITAL  ·  DO NOT REMOVE</w:t>
                   </w:r>
                 </w:p>
                 <w:p>
@@ -819,7 +819,7 @@
                       <w:color w:val="555555"/>
                       <w:sz w:val="13"/>
                     </w:rPr>
-                    <w:t>Property of MCTV Digital  |  portal@mctvofms.com</w:t>
+                    <w:t>Questions? 601-201-8202  |  portal@mctvofms.com</w:t>
                   </w:r>
                 </w:p>
               </w:tc>
@@ -935,7 +935,7 @@
                       <w:color w:val="C5A55A"/>
                       <w:sz w:val="13"/>
                     </w:rPr>
-                    <w:t>MCTV DIGITAL  ·  DO NOT REMOVE</w:t>
+                    <w:t>PROPERTY OF MCTV DIGITAL  ·  DO NOT REMOVE</w:t>
                   </w:r>
                 </w:p>
                 <w:p>
@@ -991,7 +991,7 @@
                       <w:color w:val="555555"/>
                       <w:sz w:val="13"/>
                     </w:rPr>
-                    <w:t>Property of MCTV Digital  |  portal@mctvofms.com</w:t>
+                    <w:t>Questions? 601-201-8202  |  portal@mctvofms.com</w:t>
                   </w:r>
                 </w:p>
               </w:tc>
@@ -1106,7 +1106,7 @@
                       <w:color w:val="C5A55A"/>
                       <w:sz w:val="13"/>
                     </w:rPr>
-                    <w:t>MCTV DIGITAL  ·  DO NOT REMOVE</w:t>
+                    <w:t>PROPERTY OF MCTV DIGITAL  ·  DO NOT REMOVE</w:t>
                   </w:r>
                 </w:p>
                 <w:p>
@@ -1162,7 +1162,7 @@
                       <w:color w:val="555555"/>
                       <w:sz w:val="13"/>
                     </w:rPr>
-                    <w:t>Property of MCTV Digital  |  portal@mctvofms.com</w:t>
+                    <w:t>Questions? 601-201-8202  |  portal@mctvofms.com</w:t>
                   </w:r>
                 </w:p>
               </w:tc>
@@ -1278,7 +1278,7 @@
                       <w:color w:val="C5A55A"/>
                       <w:sz w:val="13"/>
                     </w:rPr>
-                    <w:t>MCTV DIGITAL  ·  DO NOT REMOVE</w:t>
+                    <w:t>PROPERTY OF MCTV DIGITAL  ·  DO NOT REMOVE</w:t>
                   </w:r>
                 </w:p>
                 <w:p>
@@ -1334,7 +1334,7 @@
                       <w:color w:val="555555"/>
                       <w:sz w:val="13"/>
                     </w:rPr>
-                    <w:t>Property of MCTV Digital  |  portal@mctvofms.com</w:t>
+                    <w:t>Questions? 601-201-8202  |  portal@mctvofms.com</w:t>
                   </w:r>
                 </w:p>
               </w:tc>
@@ -1449,7 +1449,7 @@
                       <w:color w:val="C5A55A"/>
                       <w:sz w:val="13"/>
                     </w:rPr>
-                    <w:t>MCTV DIGITAL  ·  DO NOT REMOVE</w:t>
+                    <w:t>PROPERTY OF MCTV DIGITAL  ·  DO NOT REMOVE</w:t>
                   </w:r>
                 </w:p>
                 <w:p>
@@ -1505,7 +1505,7 @@
                       <w:color w:val="555555"/>
                       <w:sz w:val="13"/>
                     </w:rPr>
-                    <w:t>Property of MCTV Digital  |  portal@mctvofms.com</w:t>
+                    <w:t>Questions? 601-201-8202  |  portal@mctvofms.com</w:t>
                   </w:r>
                 </w:p>
               </w:tc>
@@ -1621,7 +1621,7 @@
                       <w:color w:val="C5A55A"/>
                       <w:sz w:val="13"/>
                     </w:rPr>
-                    <w:t>MCTV DIGITAL  ·  DO NOT REMOVE</w:t>
+                    <w:t>PROPERTY OF MCTV DIGITAL  ·  DO NOT REMOVE</w:t>
                   </w:r>
                 </w:p>
                 <w:p>
@@ -1677,7 +1677,7 @@
                       <w:color w:val="555555"/>
                       <w:sz w:val="13"/>
                     </w:rPr>
-                    <w:t>Property of MCTV Digital  |  portal@mctvofms.com</w:t>
+                    <w:t>Questions? 601-201-8202  |  portal@mctvofms.com</w:t>
                   </w:r>
                 </w:p>
               </w:tc>
@@ -1823,7 +1823,7 @@
                       <w:color w:val="C5A55A"/>
                       <w:sz w:val="13"/>
                     </w:rPr>
-                    <w:t>MCTV DIGITAL  ·  DO NOT REMOVE</w:t>
+                    <w:t>PROPERTY OF MCTV DIGITAL  ·  DO NOT REMOVE</w:t>
                   </w:r>
                 </w:p>
                 <w:p>
@@ -1879,7 +1879,7 @@
                       <w:color w:val="555555"/>
                       <w:sz w:val="13"/>
                     </w:rPr>
-                    <w:t>Property of MCTV Digital  |  portal@mctvofms.com</w:t>
+                    <w:t>Questions? 601-201-8202  |  portal@mctvofms.com</w:t>
                   </w:r>
                 </w:p>
               </w:tc>
@@ -1995,7 +1995,7 @@
                       <w:color w:val="C5A55A"/>
                       <w:sz w:val="13"/>
                     </w:rPr>
-                    <w:t>MCTV DIGITAL  ·  DO NOT REMOVE</w:t>
+                    <w:t>PROPERTY OF MCTV DIGITAL  ·  DO NOT REMOVE</w:t>
                   </w:r>
                 </w:p>
                 <w:p>
@@ -2051,7 +2051,7 @@
                       <w:color w:val="555555"/>
                       <w:sz w:val="13"/>
                     </w:rPr>
-                    <w:t>Property of MCTV Digital  |  portal@mctvofms.com</w:t>
+                    <w:t>Questions? 601-201-8202  |  portal@mctvofms.com</w:t>
                   </w:r>
                 </w:p>
               </w:tc>
@@ -2166,7 +2166,7 @@
                       <w:color w:val="C5A55A"/>
                       <w:sz w:val="13"/>
                     </w:rPr>
-                    <w:t>MCTV DIGITAL  ·  DO NOT REMOVE</w:t>
+                    <w:t>PROPERTY OF MCTV DIGITAL  ·  DO NOT REMOVE</w:t>
                   </w:r>
                 </w:p>
                 <w:p>
@@ -2222,7 +2222,7 @@
                       <w:color w:val="555555"/>
                       <w:sz w:val="13"/>
                     </w:rPr>
-                    <w:t>Property of MCTV Digital  |  portal@mctvofms.com</w:t>
+                    <w:t>Questions? 601-201-8202  |  portal@mctvofms.com</w:t>
                   </w:r>
                 </w:p>
               </w:tc>
@@ -2338,7 +2338,7 @@
                       <w:color w:val="C5A55A"/>
                       <w:sz w:val="13"/>
                     </w:rPr>
-                    <w:t>MCTV DIGITAL  ·  DO NOT REMOVE</w:t>
+                    <w:t>PROPERTY OF MCTV DIGITAL  ·  DO NOT REMOVE</w:t>
                   </w:r>
                 </w:p>
                 <w:p>
@@ -2394,7 +2394,7 @@
                       <w:color w:val="555555"/>
                       <w:sz w:val="13"/>
                     </w:rPr>
-                    <w:t>Property of MCTV Digital  |  portal@mctvofms.com</w:t>
+                    <w:t>Questions? 601-201-8202  |  portal@mctvofms.com</w:t>
                   </w:r>
                 </w:p>
               </w:tc>
@@ -2509,7 +2509,7 @@
                       <w:color w:val="C5A55A"/>
                       <w:sz w:val="13"/>
                     </w:rPr>
-                    <w:t>MCTV DIGITAL  ·  DO NOT REMOVE</w:t>
+                    <w:t>PROPERTY OF MCTV DIGITAL  ·  DO NOT REMOVE</w:t>
                   </w:r>
                 </w:p>
                 <w:p>
@@ -2565,7 +2565,7 @@
                       <w:color w:val="555555"/>
                       <w:sz w:val="13"/>
                     </w:rPr>
-                    <w:t>Property of MCTV Digital  |  portal@mctvofms.com</w:t>
+                    <w:t>Questions? 601-201-8202  |  portal@mctvofms.com</w:t>
                   </w:r>
                 </w:p>
               </w:tc>
@@ -2681,7 +2681,7 @@
                       <w:color w:val="C5A55A"/>
                       <w:sz w:val="13"/>
                     </w:rPr>
-                    <w:t>MCTV DIGITAL  ·  DO NOT REMOVE</w:t>
+                    <w:t>PROPERTY OF MCTV DIGITAL  ·  DO NOT REMOVE</w:t>
                   </w:r>
                 </w:p>
                 <w:p>
@@ -2737,7 +2737,7 @@
                       <w:color w:val="555555"/>
                       <w:sz w:val="13"/>
                     </w:rPr>
-                    <w:t>Property of MCTV Digital  |  portal@mctvofms.com</w:t>
+                    <w:t>Questions? 601-201-8202  |  portal@mctvofms.com</w:t>
                   </w:r>
                 </w:p>
               </w:tc>
@@ -2852,7 +2852,7 @@
                       <w:color w:val="C5A55A"/>
                       <w:sz w:val="13"/>
                     </w:rPr>
-                    <w:t>MCTV DIGITAL  ·  DO NOT REMOVE</w:t>
+                    <w:t>PROPERTY OF MCTV DIGITAL  ·  DO NOT REMOVE</w:t>
                   </w:r>
                 </w:p>
                 <w:p>
@@ -2908,7 +2908,7 @@
                       <w:color w:val="555555"/>
                       <w:sz w:val="13"/>
                     </w:rPr>
-                    <w:t>Property of MCTV Digital  |  portal@mctvofms.com</w:t>
+                    <w:t>Questions? 601-201-8202  |  portal@mctvofms.com</w:t>
                   </w:r>
                 </w:p>
               </w:tc>
@@ -3024,7 +3024,7 @@
                       <w:color w:val="C5A55A"/>
                       <w:sz w:val="13"/>
                     </w:rPr>
-                    <w:t>MCTV DIGITAL  ·  DO NOT REMOVE</w:t>
+                    <w:t>PROPERTY OF MCTV DIGITAL  ·  DO NOT REMOVE</w:t>
                   </w:r>
                 </w:p>
                 <w:p>
@@ -3080,7 +3080,7 @@
                       <w:color w:val="555555"/>
                       <w:sz w:val="13"/>
                     </w:rPr>
-                    <w:t>Property of MCTV Digital  |  portal@mctvofms.com</w:t>
+                    <w:t>Questions? 601-201-8202  |  portal@mctvofms.com</w:t>
                   </w:r>
                 </w:p>
               </w:tc>
@@ -3195,7 +3195,7 @@
                       <w:color w:val="C5A55A"/>
                       <w:sz w:val="13"/>
                     </w:rPr>
-                    <w:t>MCTV DIGITAL  ·  DO NOT REMOVE</w:t>
+                    <w:t>PROPERTY OF MCTV DIGITAL  ·  DO NOT REMOVE</w:t>
                   </w:r>
                 </w:p>
                 <w:p>
@@ -3251,7 +3251,7 @@
                       <w:color w:val="555555"/>
                       <w:sz w:val="13"/>
                     </w:rPr>
-                    <w:t>Property of MCTV Digital  |  portal@mctvofms.com</w:t>
+                    <w:t>Questions? 601-201-8202  |  portal@mctvofms.com</w:t>
                   </w:r>
                 </w:p>
               </w:tc>
@@ -3367,7 +3367,7 @@
                       <w:color w:val="C5A55A"/>
                       <w:sz w:val="13"/>
                     </w:rPr>
-                    <w:t>MCTV DIGITAL  ·  DO NOT REMOVE</w:t>
+                    <w:t>PROPERTY OF MCTV DIGITAL  ·  DO NOT REMOVE</w:t>
                   </w:r>
                 </w:p>
                 <w:p>
@@ -3423,7 +3423,7 @@
                       <w:color w:val="555555"/>
                       <w:sz w:val="13"/>
                     </w:rPr>
-                    <w:t>Property of MCTV Digital  |  portal@mctvofms.com</w:t>
+                    <w:t>Questions? 601-201-8202  |  portal@mctvofms.com</w:t>
                   </w:r>
                 </w:p>
               </w:tc>
@@ -3569,7 +3569,7 @@
                       <w:color w:val="C5A55A"/>
                       <w:sz w:val="13"/>
                     </w:rPr>
-                    <w:t>MCTV DIGITAL  ·  DO NOT REMOVE</w:t>
+                    <w:t>PROPERTY OF MCTV DIGITAL  ·  DO NOT REMOVE</w:t>
                   </w:r>
                 </w:p>
                 <w:p>
@@ -3625,7 +3625,7 @@
                       <w:color w:val="555555"/>
                       <w:sz w:val="13"/>
                     </w:rPr>
-                    <w:t>Property of MCTV Digital  |  portal@mctvofms.com</w:t>
+                    <w:t>Questions? 601-201-8202  |  portal@mctvofms.com</w:t>
                   </w:r>
                 </w:p>
               </w:tc>
@@ -3741,7 +3741,7 @@
                       <w:color w:val="C5A55A"/>
                       <w:sz w:val="13"/>
                     </w:rPr>
-                    <w:t>MCTV DIGITAL  ·  DO NOT REMOVE</w:t>
+                    <w:t>PROPERTY OF MCTV DIGITAL  ·  DO NOT REMOVE</w:t>
                   </w:r>
                 </w:p>
                 <w:p>
@@ -3797,7 +3797,7 @@
                       <w:color w:val="555555"/>
                       <w:sz w:val="13"/>
                     </w:rPr>
-                    <w:t>Property of MCTV Digital  |  portal@mctvofms.com</w:t>
+                    <w:t>Questions? 601-201-8202  |  portal@mctvofms.com</w:t>
                   </w:r>
                 </w:p>
               </w:tc>
@@ -3912,7 +3912,7 @@
                       <w:color w:val="C5A55A"/>
                       <w:sz w:val="13"/>
                     </w:rPr>
-                    <w:t>MCTV DIGITAL  ·  DO NOT REMOVE</w:t>
+                    <w:t>PROPERTY OF MCTV DIGITAL  ·  DO NOT REMOVE</w:t>
                   </w:r>
                 </w:p>
                 <w:p>
@@ -3968,7 +3968,7 @@
                       <w:color w:val="555555"/>
                       <w:sz w:val="13"/>
                     </w:rPr>
-                    <w:t>Property of MCTV Digital  |  portal@mctvofms.com</w:t>
+                    <w:t>Questions? 601-201-8202  |  portal@mctvofms.com</w:t>
                   </w:r>
                 </w:p>
               </w:tc>
@@ -4084,7 +4084,7 @@
                       <w:color w:val="C5A55A"/>
                       <w:sz w:val="13"/>
                     </w:rPr>
-                    <w:t>MCTV DIGITAL  ·  DO NOT REMOVE</w:t>
+                    <w:t>PROPERTY OF MCTV DIGITAL  ·  DO NOT REMOVE</w:t>
                   </w:r>
                 </w:p>
                 <w:p>
@@ -4140,7 +4140,7 @@
                       <w:color w:val="555555"/>
                       <w:sz w:val="13"/>
                     </w:rPr>
-                    <w:t>Property of MCTV Digital  |  portal@mctvofms.com</w:t>
+                    <w:t>Questions? 601-201-8202  |  portal@mctvofms.com</w:t>
                   </w:r>
                 </w:p>
               </w:tc>
@@ -4255,7 +4255,7 @@
                       <w:color w:val="C5A55A"/>
                       <w:sz w:val="13"/>
                     </w:rPr>
-                    <w:t>MCTV DIGITAL  ·  DO NOT REMOVE</w:t>
+                    <w:t>PROPERTY OF MCTV DIGITAL  ·  DO NOT REMOVE</w:t>
                   </w:r>
                 </w:p>
                 <w:p>
@@ -4311,7 +4311,7 @@
                       <w:color w:val="555555"/>
                       <w:sz w:val="13"/>
                     </w:rPr>
-                    <w:t>Property of MCTV Digital  |  portal@mctvofms.com</w:t>
+                    <w:t>Questions? 601-201-8202  |  portal@mctvofms.com</w:t>
                   </w:r>
                 </w:p>
               </w:tc>
@@ -4427,7 +4427,7 @@
                       <w:color w:val="C5A55A"/>
                       <w:sz w:val="13"/>
                     </w:rPr>
-                    <w:t>MCTV DIGITAL  ·  DO NOT REMOVE</w:t>
+                    <w:t>PROPERTY OF MCTV DIGITAL  ·  DO NOT REMOVE</w:t>
                   </w:r>
                 </w:p>
                 <w:p>
@@ -4483,7 +4483,7 @@
                       <w:color w:val="555555"/>
                       <w:sz w:val="13"/>
                     </w:rPr>
-                    <w:t>Property of MCTV Digital  |  portal@mctvofms.com</w:t>
+                    <w:t>Questions? 601-201-8202  |  portal@mctvofms.com</w:t>
                   </w:r>
                 </w:p>
               </w:tc>
@@ -4598,7 +4598,7 @@
                       <w:color w:val="C5A55A"/>
                       <w:sz w:val="13"/>
                     </w:rPr>
-                    <w:t>MCTV DIGITAL  ·  DO NOT REMOVE</w:t>
+                    <w:t>PROPERTY OF MCTV DIGITAL  ·  DO NOT REMOVE</w:t>
                   </w:r>
                 </w:p>
                 <w:p>
@@ -4654,7 +4654,7 @@
                       <w:color w:val="555555"/>
                       <w:sz w:val="13"/>
                     </w:rPr>
-                    <w:t>Property of MCTV Digital  |  portal@mctvofms.com</w:t>
+                    <w:t>Questions? 601-201-8202  |  portal@mctvofms.com</w:t>
                   </w:r>
                 </w:p>
               </w:tc>

</xml_diff>